<commit_message>
Fix wrong OOXML namespace domain in official IEEE template file
Same purl.oclc.org -> schemas.openxmlformats.org fix applied to all 8
reports, now applied to the source template itself so any future
report built from it starts clean. Verified: opens cleanly via
python-docx, page count (3) and extracted text unchanged.
</commit_message>
<xml_diff>
--- a/template/conference-template-a4 (1).docx
+++ b/template/conference-template-a4 (1).docx
@@ -1,6 +1,6 @@
 
 <file path=word/document.xml><?xml version="1.0" encoding="utf-8"?>
-<w:document xmlns:cx="http://schemas.microsoft.com/office/drawing/2014/chartex" xmlns:cx1="http://schemas.microsoft.com/office/drawing/2015/9/8/chartex" xmlns:cx2="http://schemas.microsoft.com/office/drawing/2015/10/21/chartex" xmlns:cx3="http://schemas.microsoft.com/office/drawing/2016/5/9/chartex" xmlns:cx4="http://schemas.microsoft.com/office/drawing/2016/5/10/chartex" xmlns:cx5="http://schemas.microsoft.com/office/drawing/2016/5/11/chartex" xmlns:cx6="http://schemas.microsoft.com/office/drawing/2016/5/12/chartex" xmlns:cx7="http://schemas.microsoft.com/office/drawing/2016/5/13/chartex" xmlns:cx8="http://schemas.microsoft.com/office/drawing/2016/5/14/chartex" xmlns:mc="http://schemas.openxmlformats.org/markup-compatibility/2006" xmlns:aink="http://schemas.microsoft.com/office/drawing/2016/ink" xmlns:am3d="http://schemas.microsoft.com/office/drawing/2017/model3d" xmlns:o="urn:schemas-microsoft-com:office:office" xmlns:oel="http://schemas.microsoft.com/office/2019/extlst" xmlns:r="http://purl.oclc.org/ooxml/officeDocument/relationships" xmlns:m="http://purl.oclc.org/ooxml/officeDocument/math" xmlns:v="urn:schemas-microsoft-com:vml" xmlns:wp14="http://schemas.microsoft.com/office/word/2010/wordprocessingDrawing" xmlns:wp="http://purl.oclc.org/ooxml/drawingml/wordprocessingDrawing" xmlns:w10="urn:schemas-microsoft-com:office:word" xmlns:w="http://purl.oclc.org/ooxml/wordprocessingml/main" xmlns:w14="http://schemas.microsoft.com/office/word/2010/wordml" xmlns:w15="http://schemas.microsoft.com/office/word/2012/wordml" xmlns:w16cex="http://schemas.microsoft.com/office/word/2018/wordml/cex" xmlns:w16cid="http://schemas.microsoft.com/office/word/2016/wordml/cid" xmlns:w16="http://schemas.microsoft.com/office/word/2018/wordml" xmlns:w16sdtdh="http://schemas.microsoft.com/office/word/2020/wordml/sdtdatahash" xmlns:w16se="http://schemas.microsoft.com/office/word/2015/wordml/symex" xmlns:wpi="http://schemas.microsoft.com/office/word/2010/wordprocessingInk" xmlns:wne="http://schemas.microsoft.com/office/word/2006/wordml" mc:Ignorable="w14 w15 w16se w16cid w16 w16cex w16sdtdh wne wp14" w:conformance="strict">
+<w:document xmlns:cx="http://schemas.microsoft.com/office/drawing/2014/chartex" xmlns:cx1="http://schemas.microsoft.com/office/drawing/2015/9/8/chartex" xmlns:cx2="http://schemas.microsoft.com/office/drawing/2015/10/21/chartex" xmlns:cx3="http://schemas.microsoft.com/office/drawing/2016/5/9/chartex" xmlns:cx4="http://schemas.microsoft.com/office/drawing/2016/5/10/chartex" xmlns:cx5="http://schemas.microsoft.com/office/drawing/2016/5/11/chartex" xmlns:cx6="http://schemas.microsoft.com/office/drawing/2016/5/12/chartex" xmlns:cx7="http://schemas.microsoft.com/office/drawing/2016/5/13/chartex" xmlns:cx8="http://schemas.microsoft.com/office/drawing/2016/5/14/chartex" xmlns:mc="http://schemas.openxmlformats.org/markup-compatibility/2006" xmlns:aink="http://schemas.microsoft.com/office/drawing/2016/ink" xmlns:am3d="http://schemas.microsoft.com/office/drawing/2017/model3d" xmlns:o="urn:schemas-microsoft-com:office:office" xmlns:oel="http://schemas.microsoft.com/office/2019/extlst" xmlns:r="http://schemas.openxmlformats.org/officeDocument/2006/relationships" xmlns:m="http://schemas.openxmlformats.org/officeDocument/2006/math" xmlns:v="urn:schemas-microsoft-com:vml" xmlns:wp14="http://schemas.microsoft.com/office/word/2010/wordprocessingDrawing" xmlns:wp="http://schemas.openxmlformats.org/drawingml/2006/wordprocessingDrawing" xmlns:w10="urn:schemas-microsoft-com:office:word" xmlns:w="http://schemas.openxmlformats.org/wordprocessingml/2006/main" xmlns:w14="http://schemas.microsoft.com/office/word/2010/wordml" xmlns:w15="http://schemas.microsoft.com/office/word/2012/wordml" xmlns:w16cex="http://schemas.microsoft.com/office/word/2018/wordml/cex" xmlns:w16cid="http://schemas.microsoft.com/office/word/2016/wordml/cid" xmlns:w16="http://schemas.microsoft.com/office/word/2018/wordml" xmlns:w16sdtdh="http://schemas.microsoft.com/office/word/2020/wordml/sdtdatahash" xmlns:w16se="http://schemas.microsoft.com/office/word/2015/wordml/symex" xmlns:wpi="http://schemas.microsoft.com/office/word/2010/wordprocessingInk" xmlns:wne="http://schemas.microsoft.com/office/word/2006/wordml" mc:Ignorable="w14 w15 w16se w16cid w16 w16cex w16sdtdh wne wp14" w:conformance="strict">
   <w:body>
     <w:p>
       <w:pPr>
@@ -3064,9 +3064,9 @@
             </wp:wrapTight>
             <wp:docPr id="1" name="Text Box 8"/>
             <wp:cNvGraphicFramePr>
-              <a:graphicFrameLocks xmlns:a="http://purl.oclc.org/ooxml/drawingml/main"/>
+              <a:graphicFrameLocks xmlns:a="http://schemas.openxmlformats.org/drawingml/2006/main"/>
             </wp:cNvGraphicFramePr>
-            <a:graphic xmlns:a="http://purl.oclc.org/ooxml/drawingml/main">
+            <a:graphic xmlns:a="http://schemas.openxmlformats.org/drawingml/2006/main">
               <a:graphicData uri="http://schemas.microsoft.com/office/word/2010/wordprocessingShape">
                 <wp:wsp>
                   <wp:cNvSpPr txBox="1">
@@ -3140,7 +3140,7 @@
 </file>
 
 <file path=word/endnotes.xml><?xml version="1.0" encoding="utf-8"?>
-<w:endnotes xmlns:cx="http://schemas.microsoft.com/office/drawing/2014/chartex" xmlns:cx1="http://schemas.microsoft.com/office/drawing/2015/9/8/chartex" xmlns:cx2="http://schemas.microsoft.com/office/drawing/2015/10/21/chartex" xmlns:cx3="http://schemas.microsoft.com/office/drawing/2016/5/9/chartex" xmlns:cx4="http://schemas.microsoft.com/office/drawing/2016/5/10/chartex" xmlns:cx5="http://schemas.microsoft.com/office/drawing/2016/5/11/chartex" xmlns:cx6="http://schemas.microsoft.com/office/drawing/2016/5/12/chartex" xmlns:cx7="http://schemas.microsoft.com/office/drawing/2016/5/13/chartex" xmlns:cx8="http://schemas.microsoft.com/office/drawing/2016/5/14/chartex" xmlns:mc="http://schemas.openxmlformats.org/markup-compatibility/2006" xmlns:aink="http://schemas.microsoft.com/office/drawing/2016/ink" xmlns:am3d="http://schemas.microsoft.com/office/drawing/2017/model3d" xmlns:o="urn:schemas-microsoft-com:office:office" xmlns:oel="http://schemas.microsoft.com/office/2019/extlst" xmlns:r="http://purl.oclc.org/ooxml/officeDocument/relationships" xmlns:m="http://purl.oclc.org/ooxml/officeDocument/math" xmlns:v="urn:schemas-microsoft-com:vml" xmlns:wp14="http://schemas.microsoft.com/office/word/2010/wordprocessingDrawing" xmlns:wp="http://purl.oclc.org/ooxml/drawingml/wordprocessingDrawing" xmlns:w10="urn:schemas-microsoft-com:office:word" xmlns:w="http://purl.oclc.org/ooxml/wordprocessingml/main" xmlns:w14="http://schemas.microsoft.com/office/word/2010/wordml" xmlns:w15="http://schemas.microsoft.com/office/word/2012/wordml" xmlns:w16cex="http://schemas.microsoft.com/office/word/2018/wordml/cex" xmlns:w16cid="http://schemas.microsoft.com/office/word/2016/wordml/cid" xmlns:w16="http://schemas.microsoft.com/office/word/2018/wordml" xmlns:w16sdtdh="http://schemas.microsoft.com/office/word/2020/wordml/sdtdatahash" xmlns:w16se="http://schemas.microsoft.com/office/word/2015/wordml/symex" xmlns:wpi="http://schemas.microsoft.com/office/word/2010/wordprocessingInk" xmlns:wne="http://schemas.microsoft.com/office/word/2006/wordml" mc:Ignorable="w14 w15 w16se w16cid w16 w16cex w16sdtdh wne wp14">
+<w:endnotes xmlns:cx="http://schemas.microsoft.com/office/drawing/2014/chartex" xmlns:cx1="http://schemas.microsoft.com/office/drawing/2015/9/8/chartex" xmlns:cx2="http://schemas.microsoft.com/office/drawing/2015/10/21/chartex" xmlns:cx3="http://schemas.microsoft.com/office/drawing/2016/5/9/chartex" xmlns:cx4="http://schemas.microsoft.com/office/drawing/2016/5/10/chartex" xmlns:cx5="http://schemas.microsoft.com/office/drawing/2016/5/11/chartex" xmlns:cx6="http://schemas.microsoft.com/office/drawing/2016/5/12/chartex" xmlns:cx7="http://schemas.microsoft.com/office/drawing/2016/5/13/chartex" xmlns:cx8="http://schemas.microsoft.com/office/drawing/2016/5/14/chartex" xmlns:mc="http://schemas.openxmlformats.org/markup-compatibility/2006" xmlns:aink="http://schemas.microsoft.com/office/drawing/2016/ink" xmlns:am3d="http://schemas.microsoft.com/office/drawing/2017/model3d" xmlns:o="urn:schemas-microsoft-com:office:office" xmlns:oel="http://schemas.microsoft.com/office/2019/extlst" xmlns:r="http://schemas.openxmlformats.org/officeDocument/2006/relationships" xmlns:m="http://schemas.openxmlformats.org/officeDocument/2006/math" xmlns:v="urn:schemas-microsoft-com:vml" xmlns:wp14="http://schemas.microsoft.com/office/word/2010/wordprocessingDrawing" xmlns:wp="http://schemas.openxmlformats.org/drawingml/2006/wordprocessingDrawing" xmlns:w10="urn:schemas-microsoft-com:office:word" xmlns:w="http://schemas.openxmlformats.org/wordprocessingml/2006/main" xmlns:w14="http://schemas.microsoft.com/office/word/2010/wordml" xmlns:w15="http://schemas.microsoft.com/office/word/2012/wordml" xmlns:w16cex="http://schemas.microsoft.com/office/word/2018/wordml/cex" xmlns:w16cid="http://schemas.microsoft.com/office/word/2016/wordml/cid" xmlns:w16="http://schemas.microsoft.com/office/word/2018/wordml" xmlns:w16sdtdh="http://schemas.microsoft.com/office/word/2020/wordml/sdtdatahash" xmlns:w16se="http://schemas.microsoft.com/office/word/2015/wordml/symex" xmlns:wpi="http://schemas.microsoft.com/office/word/2010/wordprocessingInk" xmlns:wne="http://schemas.microsoft.com/office/word/2006/wordml" mc:Ignorable="w14 w15 w16se w16cid w16 w16cex w16sdtdh wne wp14">
   <w:endnote w:type="separator" w:id="-1">
     <w:p>
       <w:r>
@@ -3159,7 +3159,7 @@
 </file>
 
 <file path=word/footer1.xml><?xml version="1.0" encoding="utf-8"?>
-<w:ftr xmlns:cx="http://schemas.microsoft.com/office/drawing/2014/chartex" xmlns:cx1="http://schemas.microsoft.com/office/drawing/2015/9/8/chartex" xmlns:cx2="http://schemas.microsoft.com/office/drawing/2015/10/21/chartex" xmlns:cx3="http://schemas.microsoft.com/office/drawing/2016/5/9/chartex" xmlns:cx4="http://schemas.microsoft.com/office/drawing/2016/5/10/chartex" xmlns:cx5="http://schemas.microsoft.com/office/drawing/2016/5/11/chartex" xmlns:cx6="http://schemas.microsoft.com/office/drawing/2016/5/12/chartex" xmlns:cx7="http://schemas.microsoft.com/office/drawing/2016/5/13/chartex" xmlns:cx8="http://schemas.microsoft.com/office/drawing/2016/5/14/chartex" xmlns:mc="http://schemas.openxmlformats.org/markup-compatibility/2006" xmlns:aink="http://schemas.microsoft.com/office/drawing/2016/ink" xmlns:am3d="http://schemas.microsoft.com/office/drawing/2017/model3d" xmlns:o="urn:schemas-microsoft-com:office:office" xmlns:oel="http://schemas.microsoft.com/office/2019/extlst" xmlns:r="http://purl.oclc.org/ooxml/officeDocument/relationships" xmlns:m="http://purl.oclc.org/ooxml/officeDocument/math" xmlns:v="urn:schemas-microsoft-com:vml" xmlns:wp14="http://schemas.microsoft.com/office/word/2010/wordprocessingDrawing" xmlns:wp="http://purl.oclc.org/ooxml/drawingml/wordprocessingDrawing" xmlns:w10="urn:schemas-microsoft-com:office:word" xmlns:w="http://purl.oclc.org/ooxml/wordprocessingml/main" xmlns:w14="http://schemas.microsoft.com/office/word/2010/wordml" xmlns:w15="http://schemas.microsoft.com/office/word/2012/wordml" xmlns:w16cex="http://schemas.microsoft.com/office/word/2018/wordml/cex" xmlns:w16cid="http://schemas.microsoft.com/office/word/2016/wordml/cid" xmlns:w16="http://schemas.microsoft.com/office/word/2018/wordml" xmlns:w16sdtdh="http://schemas.microsoft.com/office/word/2020/wordml/sdtdatahash" xmlns:w16se="http://schemas.microsoft.com/office/word/2015/wordml/symex" xmlns:wpi="http://schemas.microsoft.com/office/word/2010/wordprocessingInk" xmlns:wne="http://schemas.microsoft.com/office/word/2006/wordml" mc:Ignorable="w14 w15 w16se w16cid w16 w16cex w16sdtdh wne wp14">
+<w:ftr xmlns:cx="http://schemas.microsoft.com/office/drawing/2014/chartex" xmlns:cx1="http://schemas.microsoft.com/office/drawing/2015/9/8/chartex" xmlns:cx2="http://schemas.microsoft.com/office/drawing/2015/10/21/chartex" xmlns:cx3="http://schemas.microsoft.com/office/drawing/2016/5/9/chartex" xmlns:cx4="http://schemas.microsoft.com/office/drawing/2016/5/10/chartex" xmlns:cx5="http://schemas.microsoft.com/office/drawing/2016/5/11/chartex" xmlns:cx6="http://schemas.microsoft.com/office/drawing/2016/5/12/chartex" xmlns:cx7="http://schemas.microsoft.com/office/drawing/2016/5/13/chartex" xmlns:cx8="http://schemas.microsoft.com/office/drawing/2016/5/14/chartex" xmlns:mc="http://schemas.openxmlformats.org/markup-compatibility/2006" xmlns:aink="http://schemas.microsoft.com/office/drawing/2016/ink" xmlns:am3d="http://schemas.microsoft.com/office/drawing/2017/model3d" xmlns:o="urn:schemas-microsoft-com:office:office" xmlns:oel="http://schemas.microsoft.com/office/2019/extlst" xmlns:r="http://schemas.openxmlformats.org/officeDocument/2006/relationships" xmlns:m="http://schemas.openxmlformats.org/officeDocument/2006/math" xmlns:v="urn:schemas-microsoft-com:vml" xmlns:wp14="http://schemas.microsoft.com/office/word/2010/wordprocessingDrawing" xmlns:wp="http://schemas.openxmlformats.org/drawingml/2006/wordprocessingDrawing" xmlns:w10="urn:schemas-microsoft-com:office:word" xmlns:w="http://schemas.openxmlformats.org/wordprocessingml/2006/main" xmlns:w14="http://schemas.microsoft.com/office/word/2010/wordml" xmlns:w15="http://schemas.microsoft.com/office/word/2012/wordml" xmlns:w16cex="http://schemas.microsoft.com/office/word/2018/wordml/cex" xmlns:w16cid="http://schemas.microsoft.com/office/word/2016/wordml/cid" xmlns:w16="http://schemas.microsoft.com/office/word/2018/wordml" xmlns:w16sdtdh="http://schemas.microsoft.com/office/word/2020/wordml/sdtdatahash" xmlns:w16se="http://schemas.microsoft.com/office/word/2015/wordml/symex" xmlns:wpi="http://schemas.microsoft.com/office/word/2010/wordprocessingInk" xmlns:wne="http://schemas.microsoft.com/office/word/2006/wordml" mc:Ignorable="w14 w15 w16se w16cid w16 w16cex w16sdtdh wne wp14">
   <w:p>
     <w:pPr>
       <w:pStyle w:val="Footer"/>
@@ -3181,7 +3181,7 @@
 </file>
 
 <file path=word/footnotes.xml><?xml version="1.0" encoding="utf-8"?>
-<w:footnotes xmlns:cx="http://schemas.microsoft.com/office/drawing/2014/chartex" xmlns:cx1="http://schemas.microsoft.com/office/drawing/2015/9/8/chartex" xmlns:cx2="http://schemas.microsoft.com/office/drawing/2015/10/21/chartex" xmlns:cx3="http://schemas.microsoft.com/office/drawing/2016/5/9/chartex" xmlns:cx4="http://schemas.microsoft.com/office/drawing/2016/5/10/chartex" xmlns:cx5="http://schemas.microsoft.com/office/drawing/2016/5/11/chartex" xmlns:cx6="http://schemas.microsoft.com/office/drawing/2016/5/12/chartex" xmlns:cx7="http://schemas.microsoft.com/office/drawing/2016/5/13/chartex" xmlns:cx8="http://schemas.microsoft.com/office/drawing/2016/5/14/chartex" xmlns:mc="http://schemas.openxmlformats.org/markup-compatibility/2006" xmlns:aink="http://schemas.microsoft.com/office/drawing/2016/ink" xmlns:am3d="http://schemas.microsoft.com/office/drawing/2017/model3d" xmlns:o="urn:schemas-microsoft-com:office:office" xmlns:oel="http://schemas.microsoft.com/office/2019/extlst" xmlns:r="http://purl.oclc.org/ooxml/officeDocument/relationships" xmlns:m="http://purl.oclc.org/ooxml/officeDocument/math" xmlns:v="urn:schemas-microsoft-com:vml" xmlns:wp14="http://schemas.microsoft.com/office/word/2010/wordprocessingDrawing" xmlns:wp="http://purl.oclc.org/ooxml/drawingml/wordprocessingDrawing" xmlns:w10="urn:schemas-microsoft-com:office:word" xmlns:w="http://purl.oclc.org/ooxml/wordprocessingml/main" xmlns:w14="http://schemas.microsoft.com/office/word/2010/wordml" xmlns:w15="http://schemas.microsoft.com/office/word/2012/wordml" xmlns:w16cex="http://schemas.microsoft.com/office/word/2018/wordml/cex" xmlns:w16cid="http://schemas.microsoft.com/office/word/2016/wordml/cid" xmlns:w16="http://schemas.microsoft.com/office/word/2018/wordml" xmlns:w16sdtdh="http://schemas.microsoft.com/office/word/2020/wordml/sdtdatahash" xmlns:w16se="http://schemas.microsoft.com/office/word/2015/wordml/symex" xmlns:wpi="http://schemas.microsoft.com/office/word/2010/wordprocessingInk" xmlns:wne="http://schemas.microsoft.com/office/word/2006/wordml" mc:Ignorable="w14 w15 w16se w16cid w16 w16cex w16sdtdh wne wp14">
+<w:footnotes xmlns:cx="http://schemas.microsoft.com/office/drawing/2014/chartex" xmlns:cx1="http://schemas.microsoft.com/office/drawing/2015/9/8/chartex" xmlns:cx2="http://schemas.microsoft.com/office/drawing/2015/10/21/chartex" xmlns:cx3="http://schemas.microsoft.com/office/drawing/2016/5/9/chartex" xmlns:cx4="http://schemas.microsoft.com/office/drawing/2016/5/10/chartex" xmlns:cx5="http://schemas.microsoft.com/office/drawing/2016/5/11/chartex" xmlns:cx6="http://schemas.microsoft.com/office/drawing/2016/5/12/chartex" xmlns:cx7="http://schemas.microsoft.com/office/drawing/2016/5/13/chartex" xmlns:cx8="http://schemas.microsoft.com/office/drawing/2016/5/14/chartex" xmlns:mc="http://schemas.openxmlformats.org/markup-compatibility/2006" xmlns:aink="http://schemas.microsoft.com/office/drawing/2016/ink" xmlns:am3d="http://schemas.microsoft.com/office/drawing/2017/model3d" xmlns:o="urn:schemas-microsoft-com:office:office" xmlns:oel="http://schemas.microsoft.com/office/2019/extlst" xmlns:r="http://schemas.openxmlformats.org/officeDocument/2006/relationships" xmlns:m="http://schemas.openxmlformats.org/officeDocument/2006/math" xmlns:v="urn:schemas-microsoft-com:vml" xmlns:wp14="http://schemas.microsoft.com/office/word/2010/wordprocessingDrawing" xmlns:wp="http://schemas.openxmlformats.org/drawingml/2006/wordprocessingDrawing" xmlns:w10="urn:schemas-microsoft-com:office:word" xmlns:w="http://schemas.openxmlformats.org/wordprocessingml/2006/main" xmlns:w14="http://schemas.microsoft.com/office/word/2010/wordml" xmlns:w15="http://schemas.microsoft.com/office/word/2012/wordml" xmlns:w16cex="http://schemas.microsoft.com/office/word/2018/wordml/cex" xmlns:w16cid="http://schemas.microsoft.com/office/word/2016/wordml/cid" xmlns:w16="http://schemas.microsoft.com/office/word/2018/wordml" xmlns:w16sdtdh="http://schemas.microsoft.com/office/word/2020/wordml/sdtdatahash" xmlns:w16se="http://schemas.microsoft.com/office/word/2015/wordml/symex" xmlns:wpi="http://schemas.microsoft.com/office/word/2010/wordprocessingInk" xmlns:wne="http://schemas.microsoft.com/office/word/2006/wordml" mc:Ignorable="w14 w15 w16se w16cid w16 w16cex w16sdtdh wne wp14">
   <w:footnote w:type="separator" w:id="-1">
     <w:p>
       <w:r>
@@ -3200,7 +3200,7 @@
 </file>
 
 <file path=word/numbering.xml><?xml version="1.0" encoding="utf-8"?>
-<w:numbering xmlns:cx="http://schemas.microsoft.com/office/drawing/2014/chartex" xmlns:cx1="http://schemas.microsoft.com/office/drawing/2015/9/8/chartex" xmlns:cx2="http://schemas.microsoft.com/office/drawing/2015/10/21/chartex" xmlns:cx3="http://schemas.microsoft.com/office/drawing/2016/5/9/chartex" xmlns:cx4="http://schemas.microsoft.com/office/drawing/2016/5/10/chartex" xmlns:cx5="http://schemas.microsoft.com/office/drawing/2016/5/11/chartex" xmlns:cx6="http://schemas.microsoft.com/office/drawing/2016/5/12/chartex" xmlns:cx7="http://schemas.microsoft.com/office/drawing/2016/5/13/chartex" xmlns:cx8="http://schemas.microsoft.com/office/drawing/2016/5/14/chartex" xmlns:mc="http://schemas.openxmlformats.org/markup-compatibility/2006" xmlns:aink="http://schemas.microsoft.com/office/drawing/2016/ink" xmlns:am3d="http://schemas.microsoft.com/office/drawing/2017/model3d" xmlns:o="urn:schemas-microsoft-com:office:office" xmlns:oel="http://schemas.microsoft.com/office/2019/extlst" xmlns:r="http://purl.oclc.org/ooxml/officeDocument/relationships" xmlns:m="http://purl.oclc.org/ooxml/officeDocument/math" xmlns:v="urn:schemas-microsoft-com:vml" xmlns:wp14="http://schemas.microsoft.com/office/word/2010/wordprocessingDrawing" xmlns:wp="http://purl.oclc.org/ooxml/drawingml/wordprocessingDrawing" xmlns:w10="urn:schemas-microsoft-com:office:word" xmlns:w="http://purl.oclc.org/ooxml/wordprocessingml/main" xmlns:w14="http://schemas.microsoft.com/office/word/2010/wordml" xmlns:w15="http://schemas.microsoft.com/office/word/2012/wordml" xmlns:w16cex="http://schemas.microsoft.com/office/word/2018/wordml/cex" xmlns:w16cid="http://schemas.microsoft.com/office/word/2016/wordml/cid" xmlns:w16="http://schemas.microsoft.com/office/word/2018/wordml" xmlns:w16sdtdh="http://schemas.microsoft.com/office/word/2020/wordml/sdtdatahash" xmlns:w16se="http://schemas.microsoft.com/office/word/2015/wordml/symex" xmlns:wpi="http://schemas.microsoft.com/office/word/2010/wordprocessingInk" xmlns:wne="http://schemas.microsoft.com/office/word/2006/wordml" mc:Ignorable="w14 w15 w16se w16cid w16 w16cex w16sdtdh wne wp14">
+<w:numbering xmlns:cx="http://schemas.microsoft.com/office/drawing/2014/chartex" xmlns:cx1="http://schemas.microsoft.com/office/drawing/2015/9/8/chartex" xmlns:cx2="http://schemas.microsoft.com/office/drawing/2015/10/21/chartex" xmlns:cx3="http://schemas.microsoft.com/office/drawing/2016/5/9/chartex" xmlns:cx4="http://schemas.microsoft.com/office/drawing/2016/5/10/chartex" xmlns:cx5="http://schemas.microsoft.com/office/drawing/2016/5/11/chartex" xmlns:cx6="http://schemas.microsoft.com/office/drawing/2016/5/12/chartex" xmlns:cx7="http://schemas.microsoft.com/office/drawing/2016/5/13/chartex" xmlns:cx8="http://schemas.microsoft.com/office/drawing/2016/5/14/chartex" xmlns:mc="http://schemas.openxmlformats.org/markup-compatibility/2006" xmlns:aink="http://schemas.microsoft.com/office/drawing/2016/ink" xmlns:am3d="http://schemas.microsoft.com/office/drawing/2017/model3d" xmlns:o="urn:schemas-microsoft-com:office:office" xmlns:oel="http://schemas.microsoft.com/office/2019/extlst" xmlns:r="http://schemas.openxmlformats.org/officeDocument/2006/relationships" xmlns:m="http://schemas.openxmlformats.org/officeDocument/2006/math" xmlns:v="urn:schemas-microsoft-com:vml" xmlns:wp14="http://schemas.microsoft.com/office/word/2010/wordprocessingDrawing" xmlns:wp="http://schemas.openxmlformats.org/drawingml/2006/wordprocessingDrawing" xmlns:w10="urn:schemas-microsoft-com:office:word" xmlns:w="http://schemas.openxmlformats.org/wordprocessingml/2006/main" xmlns:w14="http://schemas.microsoft.com/office/word/2010/wordml" xmlns:w15="http://schemas.microsoft.com/office/word/2012/wordml" xmlns:w16cex="http://schemas.microsoft.com/office/word/2018/wordml/cex" xmlns:w16cid="http://schemas.microsoft.com/office/word/2016/wordml/cid" xmlns:w16="http://schemas.microsoft.com/office/word/2018/wordml" xmlns:w16sdtdh="http://schemas.microsoft.com/office/word/2020/wordml/sdtdatahash" xmlns:w16se="http://schemas.microsoft.com/office/word/2015/wordml/symex" xmlns:wpi="http://schemas.microsoft.com/office/word/2010/wordprocessingInk" xmlns:wne="http://schemas.microsoft.com/office/word/2006/wordml" mc:Ignorable="w14 w15 w16se w16cid w16 w16cex w16sdtdh wne wp14">
   <w:abstractNum w:abstractNumId="0" w15:restartNumberingAfterBreak="0">
     <w:nsid w:val="FFFFFF1D"/>
     <w:multiLevelType w:val="multilevel"/>
@@ -4668,7 +4668,7 @@
 </file>
 
 <file path=word/styles.xml><?xml version="1.0" encoding="utf-8"?>
-<w:styles xmlns:mc="http://schemas.openxmlformats.org/markup-compatibility/2006" xmlns:r="http://purl.oclc.org/ooxml/officeDocument/relationships" xmlns:w="http://purl.oclc.org/ooxml/wordprocessingml/main" xmlns:w14="http://schemas.microsoft.com/office/word/2010/wordml" xmlns:w15="http://schemas.microsoft.com/office/word/2012/wordml" xmlns:w16cex="http://schemas.microsoft.com/office/word/2018/wordml/cex" xmlns:w16cid="http://schemas.microsoft.com/office/word/2016/wordml/cid" xmlns:w16="http://schemas.microsoft.com/office/word/2018/wordml" xmlns:w16sdtdh="http://schemas.microsoft.com/office/word/2020/wordml/sdtdatahash" xmlns:w16se="http://schemas.microsoft.com/office/word/2015/wordml/symex" mc:Ignorable="w14 w15 w16se w16cid w16 w16cex w16sdtdh">
+<w:styles xmlns:mc="http://schemas.openxmlformats.org/markup-compatibility/2006" xmlns:r="http://schemas.openxmlformats.org/officeDocument/2006/relationships" xmlns:w="http://schemas.openxmlformats.org/wordprocessingml/2006/main" xmlns:w14="http://schemas.microsoft.com/office/word/2010/wordml" xmlns:w15="http://schemas.microsoft.com/office/word/2012/wordml" xmlns:w16cex="http://schemas.microsoft.com/office/word/2018/wordml/cex" xmlns:w16cid="http://schemas.microsoft.com/office/word/2016/wordml/cid" xmlns:w16="http://schemas.microsoft.com/office/word/2018/wordml" xmlns:w16sdtdh="http://schemas.microsoft.com/office/word/2020/wordml/sdtdatahash" xmlns:w16se="http://schemas.microsoft.com/office/word/2015/wordml/symex" mc:Ignorable="w14 w15 w16se w16cid w16 w16cex w16sdtdh">
   <w:docDefaults>
     <w:rPrDefault>
       <w:rPr>
@@ -5404,7 +5404,7 @@
 </file>
 
 <file path=word/theme/theme1.xml><?xml version="1.0" encoding="utf-8"?>
-<a:theme xmlns:a="http://purl.oclc.org/ooxml/drawingml/main" name="Office Theme">
+<a:theme xmlns:a="http://schemas.openxmlformats.org/drawingml/2006/main" name="Office Theme">
   <a:themeElements>
     <a:clrScheme name="Office">
       <a:dk1>
@@ -5669,7 +5669,7 @@
 </file>
 
 <file path=customXml/itemProps1.xml><?xml version="1.0" encoding="utf-8"?>
-<ds:datastoreItem xmlns:ds="http://purl.oclc.org/ooxml/officeDocument/customXml" ds:itemID="{9E966C7F-158E-4883-86A6-4454069232BB}">
+<ds:datastoreItem xmlns:ds="http://schemas.openxmlformats.org/officeDocument/2006/customXml" ds:itemID="{9E966C7F-158E-4883-86A6-4454069232BB}">
   <ds:schemaRefs>
     <ds:schemaRef ds:uri="http://schemas.openxmlformats.org/officeDocument/2006/bibliography"/>
   </ds:schemaRefs>

</xml_diff>